<commit_message>
Fiks enkodingsfeil for ø i høyde-etikett
Co-Authored-By: Claude Sonnet 4.6 <noreply@anthropic.com>
</commit_message>
<xml_diff>
--- a/output/tables/tabell1_baseline.docx
+++ b/output/tables/tabell1_baseline.docx
@@ -3712,7 +3712,62 @@
         <w:tc>
           <w:tcPr>
             <w:tcBorders>
-              <w:bottom w:val="single" w:sz="4" w:space="0" w:color="B3B3B3"/>
+              <w:bottom w:val="none" w:sz="0" w:space="0" w:color="000000"/>
+              <w:top w:val="single" w:sz="4" w:space="0" w:color="B3B3B3"/>
+              <w:left w:val="none" w:sz="0" w:space="0" w:color="000000"/>
+              <w:right w:val="none" w:sz="0" w:space="0" w:color="000000"/>
+            </w:tcBorders>
+            <w:shd w:val="clear" w:color="auto" w:fill="F5F5F5"/>
+            <w:tcMar>
+              <w:top w:w="0" w:type="dxa"/>
+              <w:bottom w:w="0" w:type="dxa"/>
+              <w:left w:w="0" w:type="dxa"/>
+              <w:right w:w="0" w:type="dxa"/>
+            </w:tcMar>
+            <w:vAlign w:val="center"/>
+          </w:tcPr>
+          <w:p>
+            <w:pPr>
+              <w:pStyle w:val="Normal"/>
+              <w:jc w:val="left"/>
+              <w:pBdr>
+                <w:bottom w:val="none" w:sz="0" w:space="0" w:color="000000"/>
+                <w:top w:val="none" w:sz="0" w:space="0" w:color="000000"/>
+                <w:left w:val="none" w:sz="0" w:space="0" w:color="000000"/>
+                <w:right w:val="none" w:sz="0" w:space="0" w:color="000000"/>
+              </w:pBdr>
+              <w:spacing w:after="100" w:before="100" w:line="240"/>
+              <w:ind w:left="100" w:right="100" w:firstLine="0" w:firstLineChars="0"/>
+              <w:rPr>
+                <w:rFonts w:ascii="Times New Roman" w:hAnsi="Times New Roman" w:eastAsia="Times New Roman" w:cs="Times New Roman"/>
+                <w:i w:val="true"/>
+                <w:b w:val="false"/>
+                <w:u w:val="none"/>
+                <w:strike w:val="false"/>
+                <w:sz w:val="20"/>
+                <w:szCs w:val="20"/>
+                <w:color w:val="000000"/>
+              </w:rPr>
+            </w:pPr>
+            <w:r>
+              <w:rPr>
+                <w:rFonts w:ascii="Times New Roman" w:hAnsi="Times New Roman" w:eastAsia="Times New Roman" w:cs="Times New Roman"/>
+                <w:i w:val="true"/>
+                <w:b w:val="false"/>
+                <w:u w:val="none"/>
+                <w:strike w:val="false"/>
+                <w:sz w:val="20"/>
+                <w:szCs w:val="20"/>
+                <w:color w:val="000000"/>
+              </w:rPr>
+              <w:t xml:space="preserve">  Prostata</w:t>
+            </w:r>
+          </w:p>
+        </w:tc>
+        <w:tc>
+          <w:tcPr>
+            <w:tcBorders>
+              <w:bottom w:val="single" w:sz="12" w:space="0" w:color="666666"/>
               <w:top w:val="none" w:sz="0" w:space="0" w:color="000000"/>
               <w:left w:val="none" w:sz="0" w:space="0" w:color="000000"/>
               <w:right w:val="none" w:sz="0" w:space="0" w:color="000000"/>
@@ -3729,45 +3784,45 @@
           <w:p>
             <w:pPr>
               <w:pStyle w:val="Normal"/>
-              <w:jc w:val="left"/>
-              <w:pBdr>
-                <w:bottom w:val="none" w:sz="0" w:space="0" w:color="000000"/>
-                <w:top w:val="none" w:sz="0" w:space="0" w:color="000000"/>
-                <w:left w:val="none" w:sz="0" w:space="0" w:color="000000"/>
-                <w:right w:val="none" w:sz="0" w:space="0" w:color="000000"/>
-              </w:pBdr>
-              <w:spacing w:after="100" w:before="100" w:line="240"/>
-              <w:ind w:left="100" w:right="100" w:firstLine="0" w:firstLineChars="0"/>
-              <w:rPr>
-                <w:rFonts w:ascii="Times New Roman" w:hAnsi="Times New Roman" w:eastAsia="Times New Roman" w:cs="Times New Roman"/>
-                <w:i w:val="true"/>
-                <w:b w:val="false"/>
-                <w:u w:val="none"/>
-                <w:strike w:val="false"/>
-                <w:sz w:val="20"/>
-                <w:szCs w:val="20"/>
-                <w:color w:val="000000"/>
-              </w:rPr>
-            </w:pPr>
-            <w:r>
-              <w:rPr>
-                <w:rFonts w:ascii="Times New Roman" w:hAnsi="Times New Roman" w:eastAsia="Times New Roman" w:cs="Times New Roman"/>
-                <w:i w:val="true"/>
-                <w:b w:val="false"/>
-                <w:u w:val="none"/>
-                <w:strike w:val="false"/>
-                <w:sz w:val="20"/>
-                <w:szCs w:val="20"/>
-                <w:color w:val="000000"/>
-              </w:rPr>
-              <w:t xml:space="preserve">  Prostata</w:t>
-            </w:r>
-          </w:p>
-        </w:tc>
-        <w:tc>
-          <w:tcPr>
-            <w:tcBorders>
-              <w:bottom w:val="single" w:sz="4" w:space="0" w:color="B3B3B3"/>
+              <w:jc w:val="center"/>
+              <w:pBdr>
+                <w:bottom w:val="none" w:sz="0" w:space="0" w:color="000000"/>
+                <w:top w:val="none" w:sz="0" w:space="0" w:color="000000"/>
+                <w:left w:val="none" w:sz="0" w:space="0" w:color="000000"/>
+                <w:right w:val="none" w:sz="0" w:space="0" w:color="000000"/>
+              </w:pBdr>
+              <w:spacing w:after="100" w:before="100" w:line="240"/>
+              <w:ind w:left="100" w:right="100" w:firstLine="0" w:firstLineChars="0"/>
+              <w:rPr>
+                <w:rFonts w:ascii="Times New Roman" w:hAnsi="Times New Roman" w:eastAsia="Times New Roman" w:cs="Times New Roman"/>
+                <w:i w:val="false"/>
+                <w:b w:val="false"/>
+                <w:u w:val="none"/>
+                <w:strike w:val="false"/>
+                <w:sz w:val="20"/>
+                <w:szCs w:val="20"/>
+                <w:color w:val="000000"/>
+              </w:rPr>
+            </w:pPr>
+            <w:r>
+              <w:rPr>
+                <w:rFonts w:ascii="Times New Roman" w:hAnsi="Times New Roman" w:eastAsia="Times New Roman" w:cs="Times New Roman"/>
+                <w:i w:val="false"/>
+                <w:b w:val="false"/>
+                <w:u w:val="none"/>
+                <w:strike w:val="false"/>
+                <w:sz w:val="20"/>
+                <w:szCs w:val="20"/>
+                <w:color w:val="000000"/>
+              </w:rPr>
+              <w:t xml:space="preserve">1 (6%)</w:t>
+            </w:r>
+          </w:p>
+        </w:tc>
+        <w:tc>
+          <w:tcPr>
+            <w:tcBorders>
+              <w:bottom w:val="single" w:sz="12" w:space="0" w:color="666666"/>
               <w:top w:val="none" w:sz="0" w:space="0" w:color="000000"/>
               <w:left w:val="none" w:sz="0" w:space="0" w:color="000000"/>
               <w:right w:val="none" w:sz="0" w:space="0" w:color="000000"/>
@@ -3815,61 +3870,6 @@
                 <w:szCs w:val="20"/>
                 <w:color w:val="000000"/>
               </w:rPr>
-              <w:t xml:space="preserve">1 (6%)</w:t>
-            </w:r>
-          </w:p>
-        </w:tc>
-        <w:tc>
-          <w:tcPr>
-            <w:tcBorders>
-              <w:bottom w:val="single" w:sz="4" w:space="0" w:color="B3B3B3"/>
-              <w:top w:val="none" w:sz="0" w:space="0" w:color="000000"/>
-              <w:left w:val="none" w:sz="0" w:space="0" w:color="000000"/>
-              <w:right w:val="none" w:sz="0" w:space="0" w:color="000000"/>
-            </w:tcBorders>
-            <w:shd w:val="clear" w:color="auto" w:fill="FFFFFF"/>
-            <w:tcMar>
-              <w:top w:w="0" w:type="dxa"/>
-              <w:bottom w:w="0" w:type="dxa"/>
-              <w:left w:w="0" w:type="dxa"/>
-              <w:right w:w="0" w:type="dxa"/>
-            </w:tcMar>
-            <w:vAlign w:val="center"/>
-          </w:tcPr>
-          <w:p>
-            <w:pPr>
-              <w:pStyle w:val="Normal"/>
-              <w:jc w:val="center"/>
-              <w:pBdr>
-                <w:bottom w:val="none" w:sz="0" w:space="0" w:color="000000"/>
-                <w:top w:val="none" w:sz="0" w:space="0" w:color="000000"/>
-                <w:left w:val="none" w:sz="0" w:space="0" w:color="000000"/>
-                <w:right w:val="none" w:sz="0" w:space="0" w:color="000000"/>
-              </w:pBdr>
-              <w:spacing w:after="100" w:before="100" w:line="240"/>
-              <w:ind w:left="100" w:right="100" w:firstLine="0" w:firstLineChars="0"/>
-              <w:rPr>
-                <w:rFonts w:ascii="Times New Roman" w:hAnsi="Times New Roman" w:eastAsia="Times New Roman" w:cs="Times New Roman"/>
-                <w:i w:val="false"/>
-                <w:b w:val="false"/>
-                <w:u w:val="none"/>
-                <w:strike w:val="false"/>
-                <w:sz w:val="20"/>
-                <w:szCs w:val="20"/>
-                <w:color w:val="000000"/>
-              </w:rPr>
-            </w:pPr>
-            <w:r>
-              <w:rPr>
-                <w:rFonts w:ascii="Times New Roman" w:hAnsi="Times New Roman" w:eastAsia="Times New Roman" w:cs="Times New Roman"/>
-                <w:i w:val="false"/>
-                <w:b w:val="false"/>
-                <w:u w:val="none"/>
-                <w:strike w:val="false"/>
-                <w:sz w:val="20"/>
-                <w:szCs w:val="20"/>
-                <w:color w:val="000000"/>
-              </w:rPr>
               <w:t xml:space="preserve">1 (7%)</w:t>
             </w:r>
           </w:p>
@@ -3877,7 +3877,7 @@
         <w:tc>
           <w:tcPr>
             <w:tcBorders>
-              <w:bottom w:val="single" w:sz="4" w:space="0" w:color="B3B3B3"/>
+              <w:bottom w:val="single" w:sz="12" w:space="0" w:color="666666"/>
               <w:top w:val="none" w:sz="0" w:space="0" w:color="000000"/>
               <w:left w:val="none" w:sz="0" w:space="0" w:color="000000"/>
               <w:right w:val="none" w:sz="0" w:space="0" w:color="000000"/>
@@ -3937,55 +3937,110 @@
         <w:tc>
           <w:tcPr>
             <w:tcBorders>
+              <w:bottom w:val="single" w:sz="12" w:space="0" w:color="666666"/>
+              <w:top w:val="none" w:sz="0" w:space="0" w:color="000000"/>
+              <w:left w:val="none" w:sz="0" w:space="0" w:color="000000"/>
+              <w:right w:val="none" w:sz="0" w:space="0" w:color="000000"/>
+            </w:tcBorders>
+            <w:shd w:val="clear" w:color="auto" w:fill="FFFFFF"/>
+            <w:tcMar>
+              <w:top w:w="0" w:type="dxa"/>
+              <w:bottom w:w="0" w:type="dxa"/>
+              <w:left w:w="0" w:type="dxa"/>
+              <w:right w:w="0" w:type="dxa"/>
+            </w:tcMar>
+            <w:vAlign w:val="center"/>
+          </w:tcPr>
+          <w:p>
+            <w:pPr>
+              <w:pStyle w:val="Normal"/>
+              <w:jc w:val="left"/>
+              <w:pBdr>
+                <w:bottom w:val="none" w:sz="0" w:space="0" w:color="000000"/>
+                <w:top w:val="none" w:sz="0" w:space="0" w:color="000000"/>
+                <w:left w:val="none" w:sz="0" w:space="0" w:color="000000"/>
+                <w:right w:val="none" w:sz="0" w:space="0" w:color="000000"/>
+              </w:pBdr>
+              <w:spacing w:after="100" w:before="100" w:line="240"/>
+              <w:ind w:left="100" w:right="100" w:firstLine="0" w:firstLineChars="0"/>
+              <w:rPr>
+                <w:rFonts w:ascii="Times New Roman" w:hAnsi="Times New Roman" w:eastAsia="Times New Roman" w:cs="Times New Roman"/>
+                <w:i w:val="false"/>
+                <w:b w:val="false"/>
+                <w:u w:val="none"/>
+                <w:strike w:val="false"/>
+                <w:sz w:val="20"/>
+                <w:szCs w:val="20"/>
+                <w:color w:val="000000"/>
+              </w:rPr>
+            </w:pPr>
+            <w:r>
+              <w:rPr>
+                <w:rFonts w:ascii="Times New Roman" w:hAnsi="Times New Roman" w:eastAsia="Times New Roman" w:cs="Times New Roman"/>
+                <w:i w:val="false"/>
+                <w:b w:val="false"/>
+                <w:u w:val="none"/>
+                <w:strike w:val="false"/>
+                <w:sz w:val="20"/>
+                <w:szCs w:val="20"/>
+                <w:color w:val="000000"/>
+              </w:rPr>
+              <w:t xml:space="preserve">Dager siden siste behandling, gj.snitt (SD)</w:t>
+            </w:r>
+          </w:p>
+        </w:tc>
+        <w:tc>
+          <w:tcPr>
+            <w:tcBorders>
               <w:bottom w:val="single" w:sz="4" w:space="0" w:color="B3B3B3"/>
-              <w:top w:val="single" w:sz="4" w:space="0" w:color="B3B3B3"/>
-              <w:left w:val="none" w:sz="0" w:space="0" w:color="000000"/>
-              <w:right w:val="none" w:sz="0" w:space="0" w:color="000000"/>
-            </w:tcBorders>
-            <w:shd w:val="clear" w:color="auto" w:fill="F5F5F5"/>
-            <w:tcMar>
-              <w:top w:w="0" w:type="dxa"/>
-              <w:bottom w:w="0" w:type="dxa"/>
-              <w:left w:w="0" w:type="dxa"/>
-              <w:right w:w="0" w:type="dxa"/>
-            </w:tcMar>
-            <w:vAlign w:val="center"/>
-          </w:tcPr>
-          <w:p>
-            <w:pPr>
-              <w:pStyle w:val="Normal"/>
-              <w:jc w:val="left"/>
-              <w:pBdr>
-                <w:bottom w:val="none" w:sz="0" w:space="0" w:color="000000"/>
-                <w:top w:val="none" w:sz="0" w:space="0" w:color="000000"/>
-                <w:left w:val="none" w:sz="0" w:space="0" w:color="000000"/>
-                <w:right w:val="none" w:sz="0" w:space="0" w:color="000000"/>
-              </w:pBdr>
-              <w:spacing w:after="100" w:before="100" w:line="240"/>
-              <w:ind w:left="100" w:right="100" w:firstLine="0" w:firstLineChars="0"/>
-              <w:rPr>
-                <w:rFonts w:ascii="Times New Roman" w:hAnsi="Times New Roman" w:eastAsia="Times New Roman" w:cs="Times New Roman"/>
-                <w:i w:val="false"/>
-                <w:b w:val="false"/>
-                <w:u w:val="none"/>
-                <w:strike w:val="false"/>
-                <w:sz w:val="20"/>
-                <w:szCs w:val="20"/>
-                <w:color w:val="000000"/>
-              </w:rPr>
-            </w:pPr>
-            <w:r>
-              <w:rPr>
-                <w:rFonts w:ascii="Times New Roman" w:hAnsi="Times New Roman" w:eastAsia="Times New Roman" w:cs="Times New Roman"/>
-                <w:i w:val="false"/>
-                <w:b w:val="false"/>
-                <w:u w:val="none"/>
-                <w:strike w:val="false"/>
-                <w:sz w:val="20"/>
-                <w:szCs w:val="20"/>
-                <w:color w:val="000000"/>
-              </w:rPr>
-              <w:t xml:space="preserve">Dager siden siste behandling, gj.snitt (SD)</w:t>
+              <w:top w:val="none" w:sz="0" w:space="0" w:color="000000"/>
+              <w:left w:val="none" w:sz="0" w:space="0" w:color="000000"/>
+              <w:right w:val="none" w:sz="0" w:space="0" w:color="000000"/>
+            </w:tcBorders>
+            <w:shd w:val="clear" w:color="auto" w:fill="FFFFFF"/>
+            <w:tcMar>
+              <w:top w:w="0" w:type="dxa"/>
+              <w:bottom w:w="0" w:type="dxa"/>
+              <w:left w:w="0" w:type="dxa"/>
+              <w:right w:w="0" w:type="dxa"/>
+            </w:tcMar>
+            <w:vAlign w:val="center"/>
+          </w:tcPr>
+          <w:p>
+            <w:pPr>
+              <w:pStyle w:val="Normal"/>
+              <w:jc w:val="center"/>
+              <w:pBdr>
+                <w:bottom w:val="none" w:sz="0" w:space="0" w:color="000000"/>
+                <w:top w:val="none" w:sz="0" w:space="0" w:color="000000"/>
+                <w:left w:val="none" w:sz="0" w:space="0" w:color="000000"/>
+                <w:right w:val="none" w:sz="0" w:space="0" w:color="000000"/>
+              </w:pBdr>
+              <w:spacing w:after="100" w:before="100" w:line="240"/>
+              <w:ind w:left="100" w:right="100" w:firstLine="0" w:firstLineChars="0"/>
+              <w:rPr>
+                <w:rFonts w:ascii="Times New Roman" w:hAnsi="Times New Roman" w:eastAsia="Times New Roman" w:cs="Times New Roman"/>
+                <w:i w:val="false"/>
+                <w:b w:val="false"/>
+                <w:u w:val="none"/>
+                <w:strike w:val="false"/>
+                <w:sz w:val="20"/>
+                <w:szCs w:val="20"/>
+                <w:color w:val="000000"/>
+              </w:rPr>
+            </w:pPr>
+            <w:r>
+              <w:rPr>
+                <w:rFonts w:ascii="Times New Roman" w:hAnsi="Times New Roman" w:eastAsia="Times New Roman" w:cs="Times New Roman"/>
+                <w:i w:val="false"/>
+                <w:b w:val="false"/>
+                <w:u w:val="none"/>
+                <w:strike w:val="false"/>
+                <w:sz w:val="20"/>
+                <w:szCs w:val="20"/>
+                <w:color w:val="000000"/>
+              </w:rPr>
+              <w:t xml:space="preserve">868.8 (693.6)</w:t>
             </w:r>
           </w:p>
         </w:tc>
@@ -3993,54 +4048,54 @@
           <w:tcPr>
             <w:tcBorders>
               <w:bottom w:val="single" w:sz="4" w:space="0" w:color="B3B3B3"/>
-              <w:top w:val="single" w:sz="4" w:space="0" w:color="B3B3B3"/>
-              <w:left w:val="none" w:sz="0" w:space="0" w:color="000000"/>
-              <w:right w:val="none" w:sz="0" w:space="0" w:color="000000"/>
-            </w:tcBorders>
-            <w:shd w:val="clear" w:color="auto" w:fill="F5F5F5"/>
-            <w:tcMar>
-              <w:top w:w="0" w:type="dxa"/>
-              <w:bottom w:w="0" w:type="dxa"/>
-              <w:left w:w="0" w:type="dxa"/>
-              <w:right w:w="0" w:type="dxa"/>
-            </w:tcMar>
-            <w:vAlign w:val="center"/>
-          </w:tcPr>
-          <w:p>
-            <w:pPr>
-              <w:pStyle w:val="Normal"/>
-              <w:jc w:val="center"/>
-              <w:pBdr>
-                <w:bottom w:val="none" w:sz="0" w:space="0" w:color="000000"/>
-                <w:top w:val="none" w:sz="0" w:space="0" w:color="000000"/>
-                <w:left w:val="none" w:sz="0" w:space="0" w:color="000000"/>
-                <w:right w:val="none" w:sz="0" w:space="0" w:color="000000"/>
-              </w:pBdr>
-              <w:spacing w:after="100" w:before="100" w:line="240"/>
-              <w:ind w:left="100" w:right="100" w:firstLine="0" w:firstLineChars="0"/>
-              <w:rPr>
-                <w:rFonts w:ascii="Times New Roman" w:hAnsi="Times New Roman" w:eastAsia="Times New Roman" w:cs="Times New Roman"/>
-                <w:i w:val="false"/>
-                <w:b w:val="false"/>
-                <w:u w:val="none"/>
-                <w:strike w:val="false"/>
-                <w:sz w:val="20"/>
-                <w:szCs w:val="20"/>
-                <w:color w:val="000000"/>
-              </w:rPr>
-            </w:pPr>
-            <w:r>
-              <w:rPr>
-                <w:rFonts w:ascii="Times New Roman" w:hAnsi="Times New Roman" w:eastAsia="Times New Roman" w:cs="Times New Roman"/>
-                <w:i w:val="false"/>
-                <w:b w:val="false"/>
-                <w:u w:val="none"/>
-                <w:strike w:val="false"/>
-                <w:sz w:val="20"/>
-                <w:szCs w:val="20"/>
-                <w:color w:val="000000"/>
-              </w:rPr>
-              <w:t xml:space="preserve">868.8 (693.6)</w:t>
+              <w:top w:val="none" w:sz="0" w:space="0" w:color="000000"/>
+              <w:left w:val="none" w:sz="0" w:space="0" w:color="000000"/>
+              <w:right w:val="none" w:sz="0" w:space="0" w:color="000000"/>
+            </w:tcBorders>
+            <w:shd w:val="clear" w:color="auto" w:fill="FFFFFF"/>
+            <w:tcMar>
+              <w:top w:w="0" w:type="dxa"/>
+              <w:bottom w:w="0" w:type="dxa"/>
+              <w:left w:w="0" w:type="dxa"/>
+              <w:right w:w="0" w:type="dxa"/>
+            </w:tcMar>
+            <w:vAlign w:val="center"/>
+          </w:tcPr>
+          <w:p>
+            <w:pPr>
+              <w:pStyle w:val="Normal"/>
+              <w:jc w:val="center"/>
+              <w:pBdr>
+                <w:bottom w:val="none" w:sz="0" w:space="0" w:color="000000"/>
+                <w:top w:val="none" w:sz="0" w:space="0" w:color="000000"/>
+                <w:left w:val="none" w:sz="0" w:space="0" w:color="000000"/>
+                <w:right w:val="none" w:sz="0" w:space="0" w:color="000000"/>
+              </w:pBdr>
+              <w:spacing w:after="100" w:before="100" w:line="240"/>
+              <w:ind w:left="100" w:right="100" w:firstLine="0" w:firstLineChars="0"/>
+              <w:rPr>
+                <w:rFonts w:ascii="Times New Roman" w:hAnsi="Times New Roman" w:eastAsia="Times New Roman" w:cs="Times New Roman"/>
+                <w:i w:val="false"/>
+                <w:b w:val="false"/>
+                <w:u w:val="none"/>
+                <w:strike w:val="false"/>
+                <w:sz w:val="20"/>
+                <w:szCs w:val="20"/>
+                <w:color w:val="000000"/>
+              </w:rPr>
+            </w:pPr>
+            <w:r>
+              <w:rPr>
+                <w:rFonts w:ascii="Times New Roman" w:hAnsi="Times New Roman" w:eastAsia="Times New Roman" w:cs="Times New Roman"/>
+                <w:i w:val="false"/>
+                <w:b w:val="false"/>
+                <w:u w:val="none"/>
+                <w:strike w:val="false"/>
+                <w:sz w:val="20"/>
+                <w:szCs w:val="20"/>
+                <w:color w:val="000000"/>
+              </w:rPr>
+              <w:t xml:space="preserve">435.0 (599.4)</w:t>
             </w:r>
           </w:p>
         </w:tc>
@@ -4048,66 +4103,11 @@
           <w:tcPr>
             <w:tcBorders>
               <w:bottom w:val="single" w:sz="4" w:space="0" w:color="B3B3B3"/>
-              <w:top w:val="single" w:sz="4" w:space="0" w:color="B3B3B3"/>
-              <w:left w:val="none" w:sz="0" w:space="0" w:color="000000"/>
-              <w:right w:val="none" w:sz="0" w:space="0" w:color="000000"/>
-            </w:tcBorders>
-            <w:shd w:val="clear" w:color="auto" w:fill="F5F5F5"/>
-            <w:tcMar>
-              <w:top w:w="0" w:type="dxa"/>
-              <w:bottom w:w="0" w:type="dxa"/>
-              <w:left w:w="0" w:type="dxa"/>
-              <w:right w:w="0" w:type="dxa"/>
-            </w:tcMar>
-            <w:vAlign w:val="center"/>
-          </w:tcPr>
-          <w:p>
-            <w:pPr>
-              <w:pStyle w:val="Normal"/>
-              <w:jc w:val="center"/>
-              <w:pBdr>
-                <w:bottom w:val="none" w:sz="0" w:space="0" w:color="000000"/>
-                <w:top w:val="none" w:sz="0" w:space="0" w:color="000000"/>
-                <w:left w:val="none" w:sz="0" w:space="0" w:color="000000"/>
-                <w:right w:val="none" w:sz="0" w:space="0" w:color="000000"/>
-              </w:pBdr>
-              <w:spacing w:after="100" w:before="100" w:line="240"/>
-              <w:ind w:left="100" w:right="100" w:firstLine="0" w:firstLineChars="0"/>
-              <w:rPr>
-                <w:rFonts w:ascii="Times New Roman" w:hAnsi="Times New Roman" w:eastAsia="Times New Roman" w:cs="Times New Roman"/>
-                <w:i w:val="false"/>
-                <w:b w:val="false"/>
-                <w:u w:val="none"/>
-                <w:strike w:val="false"/>
-                <w:sz w:val="20"/>
-                <w:szCs w:val="20"/>
-                <w:color w:val="000000"/>
-              </w:rPr>
-            </w:pPr>
-            <w:r>
-              <w:rPr>
-                <w:rFonts w:ascii="Times New Roman" w:hAnsi="Times New Roman" w:eastAsia="Times New Roman" w:cs="Times New Roman"/>
-                <w:i w:val="false"/>
-                <w:b w:val="false"/>
-                <w:u w:val="none"/>
-                <w:strike w:val="false"/>
-                <w:sz w:val="20"/>
-                <w:szCs w:val="20"/>
-                <w:color w:val="000000"/>
-              </w:rPr>
-              <w:t xml:space="preserve">435.0 (599.4)</w:t>
-            </w:r>
-          </w:p>
-        </w:tc>
-        <w:tc>
-          <w:tcPr>
-            <w:tcBorders>
-              <w:bottom w:val="single" w:sz="4" w:space="0" w:color="B3B3B3"/>
-              <w:top w:val="single" w:sz="4" w:space="0" w:color="B3B3B3"/>
-              <w:left w:val="none" w:sz="0" w:space="0" w:color="000000"/>
-              <w:right w:val="none" w:sz="0" w:space="0" w:color="000000"/>
-            </w:tcBorders>
-            <w:shd w:val="clear" w:color="auto" w:fill="F5F5F5"/>
+              <w:top w:val="none" w:sz="0" w:space="0" w:color="000000"/>
+              <w:left w:val="none" w:sz="0" w:space="0" w:color="000000"/>
+              <w:right w:val="none" w:sz="0" w:space="0" w:color="000000"/>
+            </w:tcBorders>
+            <w:shd w:val="clear" w:color="auto" w:fill="FFFFFF"/>
             <w:tcMar>
               <w:top w:w="0" w:type="dxa"/>
               <w:bottom w:w="0" w:type="dxa"/>
@@ -5062,7 +5062,62 @@
         <w:tc>
           <w:tcPr>
             <w:tcBorders>
-              <w:bottom w:val="single" w:sz="4" w:space="0" w:color="B3B3B3"/>
+              <w:bottom w:val="none" w:sz="0" w:space="0" w:color="000000"/>
+              <w:top w:val="single" w:sz="4" w:space="0" w:color="B3B3B3"/>
+              <w:left w:val="none" w:sz="0" w:space="0" w:color="000000"/>
+              <w:right w:val="none" w:sz="0" w:space="0" w:color="000000"/>
+            </w:tcBorders>
+            <w:shd w:val="clear" w:color="auto" w:fill="F5F5F5"/>
+            <w:tcMar>
+              <w:top w:w="0" w:type="dxa"/>
+              <w:bottom w:w="0" w:type="dxa"/>
+              <w:left w:w="0" w:type="dxa"/>
+              <w:right w:w="0" w:type="dxa"/>
+            </w:tcMar>
+            <w:vAlign w:val="center"/>
+          </w:tcPr>
+          <w:p>
+            <w:pPr>
+              <w:pStyle w:val="Normal"/>
+              <w:jc w:val="left"/>
+              <w:pBdr>
+                <w:bottom w:val="none" w:sz="0" w:space="0" w:color="000000"/>
+                <w:top w:val="none" w:sz="0" w:space="0" w:color="000000"/>
+                <w:left w:val="none" w:sz="0" w:space="0" w:color="000000"/>
+                <w:right w:val="none" w:sz="0" w:space="0" w:color="000000"/>
+              </w:pBdr>
+              <w:spacing w:after="100" w:before="100" w:line="240"/>
+              <w:ind w:left="100" w:right="100" w:firstLine="0" w:firstLineChars="0"/>
+              <w:rPr>
+                <w:rFonts w:ascii="Times New Roman" w:hAnsi="Times New Roman" w:eastAsia="Times New Roman" w:cs="Times New Roman"/>
+                <w:i w:val="false"/>
+                <w:b w:val="false"/>
+                <w:u w:val="none"/>
+                <w:strike w:val="false"/>
+                <w:sz w:val="20"/>
+                <w:szCs w:val="20"/>
+                <w:color w:val="000000"/>
+              </w:rPr>
+            </w:pPr>
+            <w:r>
+              <w:rPr>
+                <w:rFonts w:ascii="Times New Roman" w:hAnsi="Times New Roman" w:eastAsia="Times New Roman" w:cs="Times New Roman"/>
+                <w:i w:val="false"/>
+                <w:b w:val="false"/>
+                <w:u w:val="none"/>
+                <w:strike w:val="false"/>
+                <w:sz w:val="20"/>
+                <w:szCs w:val="20"/>
+                <w:color w:val="000000"/>
+              </w:rPr>
+              <w:t xml:space="preserve">Mager masse (LBM), g, gj.snitt (SD)</w:t>
+            </w:r>
+          </w:p>
+        </w:tc>
+        <w:tc>
+          <w:tcPr>
+            <w:tcBorders>
+              <w:bottom w:val="single" w:sz="12" w:space="0" w:color="666666"/>
               <w:top w:val="none" w:sz="0" w:space="0" w:color="000000"/>
               <w:left w:val="none" w:sz="0" w:space="0" w:color="000000"/>
               <w:right w:val="none" w:sz="0" w:space="0" w:color="000000"/>
@@ -5079,45 +5134,45 @@
           <w:p>
             <w:pPr>
               <w:pStyle w:val="Normal"/>
-              <w:jc w:val="left"/>
-              <w:pBdr>
-                <w:bottom w:val="none" w:sz="0" w:space="0" w:color="000000"/>
-                <w:top w:val="none" w:sz="0" w:space="0" w:color="000000"/>
-                <w:left w:val="none" w:sz="0" w:space="0" w:color="000000"/>
-                <w:right w:val="none" w:sz="0" w:space="0" w:color="000000"/>
-              </w:pBdr>
-              <w:spacing w:after="100" w:before="100" w:line="240"/>
-              <w:ind w:left="100" w:right="100" w:firstLine="0" w:firstLineChars="0"/>
-              <w:rPr>
-                <w:rFonts w:ascii="Times New Roman" w:hAnsi="Times New Roman" w:eastAsia="Times New Roman" w:cs="Times New Roman"/>
-                <w:i w:val="false"/>
-                <w:b w:val="false"/>
-                <w:u w:val="none"/>
-                <w:strike w:val="false"/>
-                <w:sz w:val="20"/>
-                <w:szCs w:val="20"/>
-                <w:color w:val="000000"/>
-              </w:rPr>
-            </w:pPr>
-            <w:r>
-              <w:rPr>
-                <w:rFonts w:ascii="Times New Roman" w:hAnsi="Times New Roman" w:eastAsia="Times New Roman" w:cs="Times New Roman"/>
-                <w:i w:val="false"/>
-                <w:b w:val="false"/>
-                <w:u w:val="none"/>
-                <w:strike w:val="false"/>
-                <w:sz w:val="20"/>
-                <w:szCs w:val="20"/>
-                <w:color w:val="000000"/>
-              </w:rPr>
-              <w:t xml:space="preserve">Mager masse (LBM), g, gj.snitt (SD)</w:t>
-            </w:r>
-          </w:p>
-        </w:tc>
-        <w:tc>
-          <w:tcPr>
-            <w:tcBorders>
-              <w:bottom w:val="single" w:sz="4" w:space="0" w:color="B3B3B3"/>
+              <w:jc w:val="center"/>
+              <w:pBdr>
+                <w:bottom w:val="none" w:sz="0" w:space="0" w:color="000000"/>
+                <w:top w:val="none" w:sz="0" w:space="0" w:color="000000"/>
+                <w:left w:val="none" w:sz="0" w:space="0" w:color="000000"/>
+                <w:right w:val="none" w:sz="0" w:space="0" w:color="000000"/>
+              </w:pBdr>
+              <w:spacing w:after="100" w:before="100" w:line="240"/>
+              <w:ind w:left="100" w:right="100" w:firstLine="0" w:firstLineChars="0"/>
+              <w:rPr>
+                <w:rFonts w:ascii="Times New Roman" w:hAnsi="Times New Roman" w:eastAsia="Times New Roman" w:cs="Times New Roman"/>
+                <w:i w:val="false"/>
+                <w:b w:val="false"/>
+                <w:u w:val="none"/>
+                <w:strike w:val="false"/>
+                <w:sz w:val="20"/>
+                <w:szCs w:val="20"/>
+                <w:color w:val="000000"/>
+              </w:rPr>
+            </w:pPr>
+            <w:r>
+              <w:rPr>
+                <w:rFonts w:ascii="Times New Roman" w:hAnsi="Times New Roman" w:eastAsia="Times New Roman" w:cs="Times New Roman"/>
+                <w:i w:val="false"/>
+                <w:b w:val="false"/>
+                <w:u w:val="none"/>
+                <w:strike w:val="false"/>
+                <w:sz w:val="20"/>
+                <w:szCs w:val="20"/>
+                <w:color w:val="000000"/>
+              </w:rPr>
+              <w:t xml:space="preserve">47530.6 (7598.3)</w:t>
+            </w:r>
+          </w:p>
+        </w:tc>
+        <w:tc>
+          <w:tcPr>
+            <w:tcBorders>
+              <w:bottom w:val="single" w:sz="12" w:space="0" w:color="666666"/>
               <w:top w:val="none" w:sz="0" w:space="0" w:color="000000"/>
               <w:left w:val="none" w:sz="0" w:space="0" w:color="000000"/>
               <w:right w:val="none" w:sz="0" w:space="0" w:color="000000"/>
@@ -5165,61 +5220,6 @@
                 <w:szCs w:val="20"/>
                 <w:color w:val="000000"/>
               </w:rPr>
-              <w:t xml:space="preserve">47530.6 (7598.3)</w:t>
-            </w:r>
-          </w:p>
-        </w:tc>
-        <w:tc>
-          <w:tcPr>
-            <w:tcBorders>
-              <w:bottom w:val="single" w:sz="4" w:space="0" w:color="B3B3B3"/>
-              <w:top w:val="none" w:sz="0" w:space="0" w:color="000000"/>
-              <w:left w:val="none" w:sz="0" w:space="0" w:color="000000"/>
-              <w:right w:val="none" w:sz="0" w:space="0" w:color="000000"/>
-            </w:tcBorders>
-            <w:shd w:val="clear" w:color="auto" w:fill="FFFFFF"/>
-            <w:tcMar>
-              <w:top w:w="0" w:type="dxa"/>
-              <w:bottom w:w="0" w:type="dxa"/>
-              <w:left w:w="0" w:type="dxa"/>
-              <w:right w:w="0" w:type="dxa"/>
-            </w:tcMar>
-            <w:vAlign w:val="center"/>
-          </w:tcPr>
-          <w:p>
-            <w:pPr>
-              <w:pStyle w:val="Normal"/>
-              <w:jc w:val="center"/>
-              <w:pBdr>
-                <w:bottom w:val="none" w:sz="0" w:space="0" w:color="000000"/>
-                <w:top w:val="none" w:sz="0" w:space="0" w:color="000000"/>
-                <w:left w:val="none" w:sz="0" w:space="0" w:color="000000"/>
-                <w:right w:val="none" w:sz="0" w:space="0" w:color="000000"/>
-              </w:pBdr>
-              <w:spacing w:after="100" w:before="100" w:line="240"/>
-              <w:ind w:left="100" w:right="100" w:firstLine="0" w:firstLineChars="0"/>
-              <w:rPr>
-                <w:rFonts w:ascii="Times New Roman" w:hAnsi="Times New Roman" w:eastAsia="Times New Roman" w:cs="Times New Roman"/>
-                <w:i w:val="false"/>
-                <w:b w:val="false"/>
-                <w:u w:val="none"/>
-                <w:strike w:val="false"/>
-                <w:sz w:val="20"/>
-                <w:szCs w:val="20"/>
-                <w:color w:val="000000"/>
-              </w:rPr>
-            </w:pPr>
-            <w:r>
-              <w:rPr>
-                <w:rFonts w:ascii="Times New Roman" w:hAnsi="Times New Roman" w:eastAsia="Times New Roman" w:cs="Times New Roman"/>
-                <w:i w:val="false"/>
-                <w:b w:val="false"/>
-                <w:u w:val="none"/>
-                <w:strike w:val="false"/>
-                <w:sz w:val="20"/>
-                <w:szCs w:val="20"/>
-                <w:color w:val="000000"/>
-              </w:rPr>
               <w:t xml:space="preserve">44282.9 (9227.1)</w:t>
             </w:r>
           </w:p>
@@ -5227,7 +5227,7 @@
         <w:tc>
           <w:tcPr>
             <w:tcBorders>
-              <w:bottom w:val="single" w:sz="4" w:space="0" w:color="B3B3B3"/>
+              <w:bottom w:val="single" w:sz="12" w:space="0" w:color="666666"/>
               <w:top w:val="none" w:sz="0" w:space="0" w:color="000000"/>
               <w:left w:val="none" w:sz="0" w:space="0" w:color="000000"/>
               <w:right w:val="none" w:sz="0" w:space="0" w:color="000000"/>
@@ -5287,7 +5287,62 @@
         <w:tc>
           <w:tcPr>
             <w:tcBorders>
-              <w:bottom w:val="none" w:sz="0" w:space="0" w:color="000000"/>
+              <w:bottom w:val="single" w:sz="4" w:space="0" w:color="B3B3B3"/>
+              <w:top w:val="none" w:sz="0" w:space="0" w:color="000000"/>
+              <w:left w:val="none" w:sz="0" w:space="0" w:color="000000"/>
+              <w:right w:val="none" w:sz="0" w:space="0" w:color="000000"/>
+            </w:tcBorders>
+            <w:shd w:val="clear" w:color="auto" w:fill="FFFFFF"/>
+            <w:tcMar>
+              <w:top w:w="0" w:type="dxa"/>
+              <w:bottom w:w="0" w:type="dxa"/>
+              <w:left w:w="0" w:type="dxa"/>
+              <w:right w:w="0" w:type="dxa"/>
+            </w:tcMar>
+            <w:vAlign w:val="center"/>
+          </w:tcPr>
+          <w:p>
+            <w:pPr>
+              <w:pStyle w:val="Normal"/>
+              <w:jc w:val="left"/>
+              <w:pBdr>
+                <w:bottom w:val="none" w:sz="0" w:space="0" w:color="000000"/>
+                <w:top w:val="none" w:sz="0" w:space="0" w:color="000000"/>
+                <w:left w:val="none" w:sz="0" w:space="0" w:color="000000"/>
+                <w:right w:val="none" w:sz="0" w:space="0" w:color="000000"/>
+              </w:pBdr>
+              <w:spacing w:after="100" w:before="100" w:line="240"/>
+              <w:ind w:left="100" w:right="100" w:firstLine="0" w:firstLineChars="0"/>
+              <w:rPr>
+                <w:rFonts w:ascii="Times New Roman" w:hAnsi="Times New Roman" w:eastAsia="Times New Roman" w:cs="Times New Roman"/>
+                <w:i w:val="false"/>
+                <w:b w:val="false"/>
+                <w:u w:val="none"/>
+                <w:strike w:val="false"/>
+                <w:sz w:val="20"/>
+                <w:szCs w:val="20"/>
+                <w:color w:val="000000"/>
+              </w:rPr>
+            </w:pPr>
+            <w:r>
+              <w:rPr>
+                <w:rFonts w:ascii="Times New Roman" w:hAnsi="Times New Roman" w:eastAsia="Times New Roman" w:cs="Times New Roman"/>
+                <w:i w:val="false"/>
+                <w:b w:val="false"/>
+                <w:u w:val="none"/>
+                <w:strike w:val="false"/>
+                <w:sz w:val="20"/>
+                <w:szCs w:val="20"/>
+                <w:color w:val="000000"/>
+              </w:rPr>
+              <w:t xml:space="preserve">Total fettmasse, g, gj.snitt (SD)</w:t>
+            </w:r>
+          </w:p>
+        </w:tc>
+        <w:tc>
+          <w:tcPr>
+            <w:tcBorders>
+              <w:bottom w:val="single" w:sz="4" w:space="0" w:color="B3B3B3"/>
               <w:top w:val="single" w:sz="4" w:space="0" w:color="B3B3B3"/>
               <w:left w:val="none" w:sz="0" w:space="0" w:color="000000"/>
               <w:right w:val="none" w:sz="0" w:space="0" w:color="000000"/>
@@ -5304,45 +5359,45 @@
           <w:p>
             <w:pPr>
               <w:pStyle w:val="Normal"/>
-              <w:jc w:val="left"/>
-              <w:pBdr>
-                <w:bottom w:val="none" w:sz="0" w:space="0" w:color="000000"/>
-                <w:top w:val="none" w:sz="0" w:space="0" w:color="000000"/>
-                <w:left w:val="none" w:sz="0" w:space="0" w:color="000000"/>
-                <w:right w:val="none" w:sz="0" w:space="0" w:color="000000"/>
-              </w:pBdr>
-              <w:spacing w:after="100" w:before="100" w:line="240"/>
-              <w:ind w:left="100" w:right="100" w:firstLine="0" w:firstLineChars="0"/>
-              <w:rPr>
-                <w:rFonts w:ascii="Times New Roman" w:hAnsi="Times New Roman" w:eastAsia="Times New Roman" w:cs="Times New Roman"/>
-                <w:i w:val="false"/>
-                <w:b w:val="false"/>
-                <w:u w:val="none"/>
-                <w:strike w:val="false"/>
-                <w:sz w:val="20"/>
-                <w:szCs w:val="20"/>
-                <w:color w:val="000000"/>
-              </w:rPr>
-            </w:pPr>
-            <w:r>
-              <w:rPr>
-                <w:rFonts w:ascii="Times New Roman" w:hAnsi="Times New Roman" w:eastAsia="Times New Roman" w:cs="Times New Roman"/>
-                <w:i w:val="false"/>
-                <w:b w:val="false"/>
-                <w:u w:val="none"/>
-                <w:strike w:val="false"/>
-                <w:sz w:val="20"/>
-                <w:szCs w:val="20"/>
-                <w:color w:val="000000"/>
-              </w:rPr>
-              <w:t xml:space="preserve">Total fettmasse, g, gj.snitt (SD)</w:t>
-            </w:r>
-          </w:p>
-        </w:tc>
-        <w:tc>
-          <w:tcPr>
-            <w:tcBorders>
-              <w:bottom w:val="none" w:sz="0" w:space="0" w:color="000000"/>
+              <w:jc w:val="center"/>
+              <w:pBdr>
+                <w:bottom w:val="none" w:sz="0" w:space="0" w:color="000000"/>
+                <w:top w:val="none" w:sz="0" w:space="0" w:color="000000"/>
+                <w:left w:val="none" w:sz="0" w:space="0" w:color="000000"/>
+                <w:right w:val="none" w:sz="0" w:space="0" w:color="000000"/>
+              </w:pBdr>
+              <w:spacing w:after="100" w:before="100" w:line="240"/>
+              <w:ind w:left="100" w:right="100" w:firstLine="0" w:firstLineChars="0"/>
+              <w:rPr>
+                <w:rFonts w:ascii="Times New Roman" w:hAnsi="Times New Roman" w:eastAsia="Times New Roman" w:cs="Times New Roman"/>
+                <w:i w:val="false"/>
+                <w:b w:val="false"/>
+                <w:u w:val="none"/>
+                <w:strike w:val="false"/>
+                <w:sz w:val="20"/>
+                <w:szCs w:val="20"/>
+                <w:color w:val="000000"/>
+              </w:rPr>
+            </w:pPr>
+            <w:r>
+              <w:rPr>
+                <w:rFonts w:ascii="Times New Roman" w:hAnsi="Times New Roman" w:eastAsia="Times New Roman" w:cs="Times New Roman"/>
+                <w:i w:val="false"/>
+                <w:b w:val="false"/>
+                <w:u w:val="none"/>
+                <w:strike w:val="false"/>
+                <w:sz w:val="20"/>
+                <w:szCs w:val="20"/>
+                <w:color w:val="000000"/>
+              </w:rPr>
+              <w:t xml:space="preserve">29207.3 (7263.9)</w:t>
+            </w:r>
+          </w:p>
+        </w:tc>
+        <w:tc>
+          <w:tcPr>
+            <w:tcBorders>
+              <w:bottom w:val="single" w:sz="4" w:space="0" w:color="B3B3B3"/>
               <w:top w:val="single" w:sz="4" w:space="0" w:color="B3B3B3"/>
               <w:left w:val="none" w:sz="0" w:space="0" w:color="000000"/>
               <w:right w:val="none" w:sz="0" w:space="0" w:color="000000"/>
@@ -5390,61 +5445,6 @@
                 <w:szCs w:val="20"/>
                 <w:color w:val="000000"/>
               </w:rPr>
-              <w:t xml:space="preserve">29207.3 (7263.9)</w:t>
-            </w:r>
-          </w:p>
-        </w:tc>
-        <w:tc>
-          <w:tcPr>
-            <w:tcBorders>
-              <w:bottom w:val="none" w:sz="0" w:space="0" w:color="000000"/>
-              <w:top w:val="single" w:sz="4" w:space="0" w:color="B3B3B3"/>
-              <w:left w:val="none" w:sz="0" w:space="0" w:color="000000"/>
-              <w:right w:val="none" w:sz="0" w:space="0" w:color="000000"/>
-            </w:tcBorders>
-            <w:shd w:val="clear" w:color="auto" w:fill="F5F5F5"/>
-            <w:tcMar>
-              <w:top w:w="0" w:type="dxa"/>
-              <w:bottom w:w="0" w:type="dxa"/>
-              <w:left w:w="0" w:type="dxa"/>
-              <w:right w:w="0" w:type="dxa"/>
-            </w:tcMar>
-            <w:vAlign w:val="center"/>
-          </w:tcPr>
-          <w:p>
-            <w:pPr>
-              <w:pStyle w:val="Normal"/>
-              <w:jc w:val="center"/>
-              <w:pBdr>
-                <w:bottom w:val="none" w:sz="0" w:space="0" w:color="000000"/>
-                <w:top w:val="none" w:sz="0" w:space="0" w:color="000000"/>
-                <w:left w:val="none" w:sz="0" w:space="0" w:color="000000"/>
-                <w:right w:val="none" w:sz="0" w:space="0" w:color="000000"/>
-              </w:pBdr>
-              <w:spacing w:after="100" w:before="100" w:line="240"/>
-              <w:ind w:left="100" w:right="100" w:firstLine="0" w:firstLineChars="0"/>
-              <w:rPr>
-                <w:rFonts w:ascii="Times New Roman" w:hAnsi="Times New Roman" w:eastAsia="Times New Roman" w:cs="Times New Roman"/>
-                <w:i w:val="false"/>
-                <w:b w:val="false"/>
-                <w:u w:val="none"/>
-                <w:strike w:val="false"/>
-                <w:sz w:val="20"/>
-                <w:szCs w:val="20"/>
-                <w:color w:val="000000"/>
-              </w:rPr>
-            </w:pPr>
-            <w:r>
-              <w:rPr>
-                <w:rFonts w:ascii="Times New Roman" w:hAnsi="Times New Roman" w:eastAsia="Times New Roman" w:cs="Times New Roman"/>
-                <w:i w:val="false"/>
-                <w:b w:val="false"/>
-                <w:u w:val="none"/>
-                <w:strike w:val="false"/>
-                <w:sz w:val="20"/>
-                <w:szCs w:val="20"/>
-                <w:color w:val="000000"/>
-              </w:rPr>
               <w:t xml:space="preserve">27363.9 (12225.4)</w:t>
             </w:r>
           </w:p>
@@ -5452,7 +5452,7 @@
         <w:tc>
           <w:tcPr>
             <w:tcBorders>
-              <w:bottom w:val="none" w:sz="0" w:space="0" w:color="000000"/>
+              <w:bottom w:val="single" w:sz="4" w:space="0" w:color="B3B3B3"/>
               <w:top w:val="single" w:sz="4" w:space="0" w:color="B3B3B3"/>
               <w:left w:val="none" w:sz="0" w:space="0" w:color="000000"/>
               <w:right w:val="none" w:sz="0" w:space="0" w:color="000000"/>
@@ -5512,12 +5512,12 @@
         <w:tc>
           <w:tcPr>
             <w:tcBorders>
-              <w:bottom w:val="single" w:sz="12" w:space="0" w:color="666666"/>
-              <w:top w:val="none" w:sz="0" w:space="0" w:color="000000"/>
-              <w:left w:val="none" w:sz="0" w:space="0" w:color="000000"/>
-              <w:right w:val="none" w:sz="0" w:space="0" w:color="000000"/>
-            </w:tcBorders>
-            <w:shd w:val="clear" w:color="auto" w:fill="FFFFFF"/>
+              <w:bottom w:val="single" w:sz="4" w:space="0" w:color="B3B3B3"/>
+              <w:top w:val="single" w:sz="4" w:space="0" w:color="B3B3B3"/>
+              <w:left w:val="none" w:sz="0" w:space="0" w:color="000000"/>
+              <w:right w:val="none" w:sz="0" w:space="0" w:color="000000"/>
+            </w:tcBorders>
+            <w:shd w:val="clear" w:color="auto" w:fill="F5F5F5"/>
             <w:tcMar>
               <w:top w:w="0" w:type="dxa"/>
               <w:bottom w:w="0" w:type="dxa"/>
@@ -5567,12 +5567,12 @@
         <w:tc>
           <w:tcPr>
             <w:tcBorders>
-              <w:bottom w:val="single" w:sz="12" w:space="0" w:color="666666"/>
-              <w:top w:val="none" w:sz="0" w:space="0" w:color="000000"/>
-              <w:left w:val="none" w:sz="0" w:space="0" w:color="000000"/>
-              <w:right w:val="none" w:sz="0" w:space="0" w:color="000000"/>
-            </w:tcBorders>
-            <w:shd w:val="clear" w:color="auto" w:fill="FFFFFF"/>
+              <w:bottom w:val="none" w:sz="0" w:space="0" w:color="000000"/>
+              <w:top w:val="single" w:sz="4" w:space="0" w:color="B3B3B3"/>
+              <w:left w:val="none" w:sz="0" w:space="0" w:color="000000"/>
+              <w:right w:val="none" w:sz="0" w:space="0" w:color="000000"/>
+            </w:tcBorders>
+            <w:shd w:val="clear" w:color="auto" w:fill="F5F5F5"/>
             <w:tcMar>
               <w:top w:w="0" w:type="dxa"/>
               <w:bottom w:w="0" w:type="dxa"/>
@@ -5622,12 +5622,12 @@
         <w:tc>
           <w:tcPr>
             <w:tcBorders>
-              <w:bottom w:val="single" w:sz="12" w:space="0" w:color="666666"/>
-              <w:top w:val="none" w:sz="0" w:space="0" w:color="000000"/>
-              <w:left w:val="none" w:sz="0" w:space="0" w:color="000000"/>
-              <w:right w:val="none" w:sz="0" w:space="0" w:color="000000"/>
-            </w:tcBorders>
-            <w:shd w:val="clear" w:color="auto" w:fill="FFFFFF"/>
+              <w:bottom w:val="none" w:sz="0" w:space="0" w:color="000000"/>
+              <w:top w:val="single" w:sz="4" w:space="0" w:color="B3B3B3"/>
+              <w:left w:val="none" w:sz="0" w:space="0" w:color="000000"/>
+              <w:right w:val="none" w:sz="0" w:space="0" w:color="000000"/>
+            </w:tcBorders>
+            <w:shd w:val="clear" w:color="auto" w:fill="F5F5F5"/>
             <w:tcMar>
               <w:top w:w="0" w:type="dxa"/>
               <w:bottom w:w="0" w:type="dxa"/>
@@ -5677,12 +5677,12 @@
         <w:tc>
           <w:tcPr>
             <w:tcBorders>
-              <w:bottom w:val="single" w:sz="12" w:space="0" w:color="666666"/>
-              <w:top w:val="none" w:sz="0" w:space="0" w:color="000000"/>
-              <w:left w:val="none" w:sz="0" w:space="0" w:color="000000"/>
-              <w:right w:val="none" w:sz="0" w:space="0" w:color="000000"/>
-            </w:tcBorders>
-            <w:shd w:val="clear" w:color="auto" w:fill="FFFFFF"/>
+              <w:bottom w:val="none" w:sz="0" w:space="0" w:color="000000"/>
+              <w:top w:val="single" w:sz="4" w:space="0" w:color="B3B3B3"/>
+              <w:left w:val="none" w:sz="0" w:space="0" w:color="000000"/>
+              <w:right w:val="none" w:sz="0" w:space="0" w:color="000000"/>
+            </w:tcBorders>
+            <w:shd w:val="clear" w:color="auto" w:fill="F5F5F5"/>
             <w:tcMar>
               <w:top w:w="0" w:type="dxa"/>
               <w:bottom w:w="0" w:type="dxa"/>

</xml_diff>

<commit_message>
Legg til aldersintervall i aldersgruppe-etiketter i tabell 1
Co-Authored-By: Claude Sonnet 4.6 <noreply@anthropic.com>
</commit_message>
<xml_diff>
--- a/output/tables/tabell1_baseline.docx
+++ b/output/tables/tabell1_baseline.docx
@@ -1113,7 +1113,7 @@
                 <w:szCs w:val="20"/>
                 <w:color w:val="000000"/>
               </w:rPr>
-              <w:t xml:space="preserve">  Unge voksne</w:t>
+              <w:t xml:space="preserve">  Unge voksne (18–44 år)</w:t>
             </w:r>
           </w:p>
         </w:tc>
@@ -1338,7 +1338,7 @@
                 <w:szCs w:val="20"/>
                 <w:color w:val="000000"/>
               </w:rPr>
-              <w:t xml:space="preserve">  Middelaldrende</w:t>
+              <w:t xml:space="preserve">  Middelaldrende (45–59 år)</w:t>
             </w:r>
           </w:p>
         </w:tc>
@@ -1563,7 +1563,7 @@
                 <w:szCs w:val="20"/>
                 <w:color w:val="000000"/>
               </w:rPr>
-              <w:t xml:space="preserve">  Eldre voksne</w:t>
+              <w:t xml:space="preserve">  Eldre voksne (60–74 år)</w:t>
             </w:r>
           </w:p>
         </w:tc>
@@ -1788,7 +1788,7 @@
                 <w:szCs w:val="20"/>
                 <w:color w:val="000000"/>
               </w:rPr>
-              <w:t xml:space="preserve">  Gamle eldre</w:t>
+              <w:t xml:space="preserve">  Gamle eldre (75+ år)</w:t>
             </w:r>
           </w:p>
         </w:tc>

</xml_diff>

<commit_message>
Legg til fotnote med SD, LBM og ISCD-referanse i tabell 1
Co-Authored-By: Claude Sonnet 4.6 <noreply@anthropic.com>
</commit_message>
<xml_diff>
--- a/output/tables/tabell1_baseline.docx
+++ b/output/tables/tabell1_baseline.docx
@@ -6004,6 +6004,67 @@
                 <w:color w:val="000000"/>
               </w:rPr>
               <w:t xml:space="preserve">37.4 (7.4)</w:t>
+            </w:r>
+          </w:p>
+        </w:tc>
+      </w:tr>
+      <w:tr>
+        <w:trPr>
+          <w:trHeight w:val="360" w:hRule="auto"/>
+        </w:trPr>
+        <w:tc>
+          <w:tcPr>
+            <w:gridSpan w:val="4"/>
+            <w:tcBorders>
+              <w:bottom w:val="none" w:sz="0" w:space="0" w:color="FFFFFF"/>
+              <w:top w:val="single" w:sz="8" w:space="0" w:color="000000"/>
+              <w:left w:val="none" w:sz="0" w:space="0" w:color="FFFFFF"/>
+              <w:right w:val="none" w:sz="0" w:space="0" w:color="FFFFFF"/>
+            </w:tcBorders>
+            <w:shd w:val="clear" w:color="auto" w:fill="FFFFFF"/>
+            <w:tcMar>
+              <w:top w:w="0" w:type="dxa"/>
+              <w:bottom w:w="0" w:type="dxa"/>
+              <w:left w:w="0" w:type="dxa"/>
+              <w:right w:w="0" w:type="dxa"/>
+            </w:tcMar>
+            <w:vAlign w:val="center"/>
+          </w:tcPr>
+          <w:p>
+            <w:pPr>
+              <w:pStyle w:val="Normal"/>
+              <w:jc w:val="left"/>
+              <w:pBdr>
+                <w:bottom w:val="none" w:sz="0" w:space="0" w:color="000000"/>
+                <w:top w:val="none" w:sz="0" w:space="0" w:color="000000"/>
+                <w:left w:val="none" w:sz="0" w:space="0" w:color="000000"/>
+                <w:right w:val="none" w:sz="0" w:space="0" w:color="000000"/>
+              </w:pBdr>
+              <w:spacing w:after="100" w:before="100" w:line="240"/>
+              <w:ind w:left="100" w:right="100" w:firstLine="0" w:firstLineChars="0"/>
+              <w:rPr>
+                <w:rFonts w:ascii="Times New Roman" w:hAnsi="Times New Roman" w:eastAsia="Times New Roman" w:cs="Times New Roman"/>
+                <w:i w:val="true"/>
+                <w:b w:val="false"/>
+                <w:u w:val="none"/>
+                <w:strike w:val="false"/>
+                <w:sz w:val="18"/>
+                <w:szCs w:val="18"/>
+                <w:color w:val="000000"/>
+              </w:rPr>
+            </w:pPr>
+            <w:r>
+              <w:rPr>
+                <w:rFonts w:ascii="Times New Roman" w:hAnsi="Times New Roman" w:eastAsia="Times New Roman" w:cs="Times New Roman"/>
+                <w:i w:val="true"/>
+                <w:b w:val="false"/>
+                <w:u w:val="none"/>
+                <w:strike w:val="false"/>
+                <w:sz w:val="18"/>
+                <w:szCs w:val="18"/>
+                <w:color w:val="000000"/>
+              </w:rPr>
+              <w:t xml:space="preserve">SD = standardavvik; LBM = lean body mass (mager kroppsmasse). For n = 6 deltakere der kroppen oversteg måleområdet til DXA-maskinen, ble offset-scanning benyttet med programvareestimert venstreside, i tråd med International Society for Clinical Densitometry (ISCD, 2023).</w:t>
             </w:r>
           </w:p>
         </w:tc>

</xml_diff>

<commit_message>
Legg til etterlevelsestabellen (Tabell 5) og fiks formatering
- Tabell 5: etterlevelse for n=50 (DXA-analysen), median med IQR
  på to linjer, anonym fotnote (3 deltakere mangler registrering)
- Tabell 1: mindre justeringer fra forrige kjøring

Co-Authored-By: Claude Sonnet 4.6 <noreply@anthropic.com>
</commit_message>
<xml_diff>
--- a/output/tables/tabell1_baseline.docx
+++ b/output/tables/tabell1_baseline.docx
@@ -1235,7 +1235,7 @@
                 <w:szCs w:val="20"/>
                 <w:color w:val="000000"/>
               </w:rPr>
-              <w:t xml:space="preserve">0.017</w:t>
+              <w:t xml:space="preserve">0.016</w:t>
             </w:r>
           </w:p>
         </w:tc>
@@ -2635,7 +2635,7 @@
                 <w:szCs w:val="20"/>
                 <w:color w:val="000000"/>
               </w:rPr>
-              <w:t xml:space="preserve">0.577</w:t>
+              <w:t xml:space="preserve">0.578</w:t>
             </w:r>
           </w:p>
         </w:tc>

</xml_diff>

<commit_message>
Update age categories from supervisor-corrected file (16.03.26)
Co-Authored-By: Claude Sonnet 4.6 <noreply@anthropic.com>
</commit_message>
<xml_diff>
--- a/output/tables/tabell1_baseline.docx
+++ b/output/tables/tabell1_baseline.docx
@@ -1235,7 +1235,7 @@
                 <w:szCs w:val="20"/>
                 <w:color w:val="000000"/>
               </w:rPr>
-              <w:t xml:space="preserve">0.016</w:t>
+              <w:t xml:space="preserve">0.007</w:t>
             </w:r>
           </w:p>
         </w:tc>
@@ -1965,62 +1965,62 @@
                 <w:szCs w:val="20"/>
                 <w:color w:val="000000"/>
               </w:rPr>
-              <w:t xml:space="preserve">21 (72%)</w:t>
-            </w:r>
-          </w:p>
-        </w:tc>
-        <w:tc>
-          <w:tcPr>
-            <w:tcBorders>
-              <w:bottom w:val="none" w:sz="0" w:space="0" w:color="000000"/>
-              <w:top w:val="none" w:sz="0" w:space="0" w:color="000000"/>
-              <w:left w:val="none" w:sz="0" w:space="0" w:color="000000"/>
-              <w:right w:val="none" w:sz="0" w:space="0" w:color="000000"/>
-            </w:tcBorders>
-            <w:shd w:val="clear" w:color="auto" w:fill="FFFFFF"/>
-            <w:tcMar>
-              <w:top w:w="0" w:type="dxa"/>
-              <w:bottom w:w="0" w:type="dxa"/>
-              <w:left w:w="0" w:type="dxa"/>
-              <w:right w:w="0" w:type="dxa"/>
-            </w:tcMar>
-            <w:vAlign w:val="center"/>
-          </w:tcPr>
-          <w:p>
-            <w:pPr>
-              <w:pStyle w:val="Normal"/>
-              <w:jc w:val="center"/>
-              <w:pBdr>
-                <w:bottom w:val="none" w:sz="0" w:space="0" w:color="000000"/>
-                <w:top w:val="none" w:sz="0" w:space="0" w:color="000000"/>
-                <w:left w:val="none" w:sz="0" w:space="0" w:color="000000"/>
-                <w:right w:val="none" w:sz="0" w:space="0" w:color="000000"/>
-              </w:pBdr>
-              <w:spacing w:after="40" w:before="40" w:line="240"/>
-              <w:ind w:left="100" w:right="100" w:firstLine="0" w:firstLineChars="0"/>
-              <w:rPr>
-                <w:rFonts w:ascii="Times New Roman" w:hAnsi="Times New Roman" w:eastAsia="Times New Roman" w:cs="Times New Roman"/>
-                <w:i w:val="false"/>
-                <w:b w:val="false"/>
-                <w:u w:val="none"/>
-                <w:strike w:val="false"/>
-                <w:sz w:val="20"/>
-                <w:szCs w:val="20"/>
-                <w:color w:val="000000"/>
-              </w:rPr>
-            </w:pPr>
-            <w:r>
-              <w:rPr>
-                <w:rFonts w:ascii="Times New Roman" w:hAnsi="Times New Roman" w:eastAsia="Times New Roman" w:cs="Times New Roman"/>
-                <w:i w:val="false"/>
-                <w:b w:val="false"/>
-                <w:u w:val="none"/>
-                <w:strike w:val="false"/>
-                <w:sz w:val="20"/>
-                <w:szCs w:val="20"/>
-                <w:color w:val="000000"/>
-              </w:rPr>
-              <w:t xml:space="preserve">29 (58%)</w:t>
+              <w:t xml:space="preserve">14 (48%)</w:t>
+            </w:r>
+          </w:p>
+        </w:tc>
+        <w:tc>
+          <w:tcPr>
+            <w:tcBorders>
+              <w:bottom w:val="none" w:sz="0" w:space="0" w:color="000000"/>
+              <w:top w:val="none" w:sz="0" w:space="0" w:color="000000"/>
+              <w:left w:val="none" w:sz="0" w:space="0" w:color="000000"/>
+              <w:right w:val="none" w:sz="0" w:space="0" w:color="000000"/>
+            </w:tcBorders>
+            <w:shd w:val="clear" w:color="auto" w:fill="FFFFFF"/>
+            <w:tcMar>
+              <w:top w:w="0" w:type="dxa"/>
+              <w:bottom w:w="0" w:type="dxa"/>
+              <w:left w:w="0" w:type="dxa"/>
+              <w:right w:w="0" w:type="dxa"/>
+            </w:tcMar>
+            <w:vAlign w:val="center"/>
+          </w:tcPr>
+          <w:p>
+            <w:pPr>
+              <w:pStyle w:val="Normal"/>
+              <w:jc w:val="center"/>
+              <w:pBdr>
+                <w:bottom w:val="none" w:sz="0" w:space="0" w:color="000000"/>
+                <w:top w:val="none" w:sz="0" w:space="0" w:color="000000"/>
+                <w:left w:val="none" w:sz="0" w:space="0" w:color="000000"/>
+                <w:right w:val="none" w:sz="0" w:space="0" w:color="000000"/>
+              </w:pBdr>
+              <w:spacing w:after="40" w:before="40" w:line="240"/>
+              <w:ind w:left="100" w:right="100" w:firstLine="0" w:firstLineChars="0"/>
+              <w:rPr>
+                <w:rFonts w:ascii="Times New Roman" w:hAnsi="Times New Roman" w:eastAsia="Times New Roman" w:cs="Times New Roman"/>
+                <w:i w:val="false"/>
+                <w:b w:val="false"/>
+                <w:u w:val="none"/>
+                <w:strike w:val="false"/>
+                <w:sz w:val="20"/>
+                <w:szCs w:val="20"/>
+                <w:color w:val="000000"/>
+              </w:rPr>
+            </w:pPr>
+            <w:r>
+              <w:rPr>
+                <w:rFonts w:ascii="Times New Roman" w:hAnsi="Times New Roman" w:eastAsia="Times New Roman" w:cs="Times New Roman"/>
+                <w:i w:val="false"/>
+                <w:b w:val="false"/>
+                <w:u w:val="none"/>
+                <w:strike w:val="false"/>
+                <w:sz w:val="20"/>
+                <w:szCs w:val="20"/>
+                <w:color w:val="000000"/>
+              </w:rPr>
+              <w:t xml:space="preserve">22 (44%)</w:t>
             </w:r>
           </w:p>
         </w:tc>
@@ -2245,7 +2245,7 @@
                 <w:szCs w:val="20"/>
                 <w:color w:val="000000"/>
               </w:rPr>
-              <w:t xml:space="preserve">1 (3%)</w:t>
+              <w:t xml:space="preserve">8 (28%)</w:t>
             </w:r>
           </w:p>
         </w:tc>
@@ -2300,7 +2300,7 @@
                 <w:szCs w:val="20"/>
                 <w:color w:val="000000"/>
               </w:rPr>
-              <w:t xml:space="preserve">1 (2%)</w:t>
+              <w:t xml:space="preserve">8 (16%)</w:t>
             </w:r>
           </w:p>
         </w:tc>

</xml_diff>